<commit_message>
Adding module 1.3 Assignment
</commit_message>
<xml_diff>
--- a/module-1/Dingeto-Assignment 1_2.docx
+++ b/module-1/Dingeto-Assignment 1_2.docx
@@ -6,6 +6,36 @@
       <w:r>
         <w:t>Girma Dingeto, CSD402, Module 1.2 Assignment</w:t>
       </w:r>
+    </w:p>
+    <w:p>
+      <w:hyperlink r:id="rId4" w:history="1">
+        <w:proofErr w:type="spellStart"/>
+        <w:r>
+          <w:rPr>
+            <w:rStyle w:val="Hyperlink"/>
+          </w:rPr>
+          <w:t>GirmaDingeto</w:t>
+        </w:r>
+        <w:proofErr w:type="spellEnd"/>
+        <w:r>
+          <w:rPr>
+            <w:rStyle w:val="Hyperlink"/>
+          </w:rPr>
+          <w:t>/csd-402: CSD402-300O Java for Pr</w:t>
+        </w:r>
+        <w:r>
+          <w:rPr>
+            <w:rStyle w:val="Hyperlink"/>
+          </w:rPr>
+          <w:t>o</w:t>
+        </w:r>
+        <w:r>
+          <w:rPr>
+            <w:rStyle w:val="Hyperlink"/>
+          </w:rPr>
+          <w:t>grammers</w:t>
+        </w:r>
+      </w:hyperlink>
     </w:p>
     <w:p>
       <w:r>
@@ -27,7 +57,7 @@
                     </pic:cNvPicPr>
                   </pic:nvPicPr>
                   <pic:blipFill>
-                    <a:blip r:embed="rId4">
+                    <a:blip r:embed="rId5">
                       <a:extLst>
                         <a:ext uri="{28A0092B-C50C-407E-A947-70E740481C1C}">
                           <a14:useLocalDpi xmlns:a14="http://schemas.microsoft.com/office/drawing/2010/main" val="0"/>
@@ -87,7 +117,7 @@
                     </pic:cNvPicPr>
                   </pic:nvPicPr>
                   <pic:blipFill>
-                    <a:blip r:embed="rId5" cstate="print">
+                    <a:blip r:embed="rId6" cstate="print">
                       <a:extLst>
                         <a:ext uri="{28A0092B-C50C-407E-A947-70E740481C1C}">
                           <a14:useLocalDpi xmlns:a14="http://schemas.microsoft.com/office/drawing/2010/main" val="0"/>
@@ -142,7 +172,7 @@
                     </pic:cNvPicPr>
                   </pic:nvPicPr>
                   <pic:blipFill>
-                    <a:blip r:embed="rId6" cstate="print">
+                    <a:blip r:embed="rId7" cstate="print">
                       <a:extLst>
                         <a:ext uri="{28A0092B-C50C-407E-A947-70E740481C1C}">
                           <a14:useLocalDpi xmlns:a14="http://schemas.microsoft.com/office/drawing/2010/main" val="0"/>
@@ -205,7 +235,7 @@
                     </pic:cNvPicPr>
                   </pic:nvPicPr>
                   <pic:blipFill>
-                    <a:blip r:embed="rId7" cstate="print">
+                    <a:blip r:embed="rId8" cstate="print">
                       <a:extLst>
                         <a:ext uri="{28A0092B-C50C-407E-A947-70E740481C1C}">
                           <a14:useLocalDpi xmlns:a14="http://schemas.microsoft.com/office/drawing/2010/main" val="0"/>
@@ -236,6 +266,108 @@
           </wp:inline>
         </w:drawing>
       </w:r>
+    </w:p>
+    <w:p>
+      <w:pPr>
+        <w:pStyle w:val="NormalWeb"/>
+      </w:pPr>
+      <w:r>
+        <w:rPr>
+          <w:noProof/>
+        </w:rPr>
+        <w:drawing>
+          <wp:inline distT="0" distB="0" distL="0" distR="0" wp14:anchorId="590C2A3D" wp14:editId="34456BA2">
+            <wp:extent cx="5780314" cy="2576468"/>
+            <wp:effectExtent l="0" t="0" r="0" b="0"/>
+            <wp:docPr id="26" name="Picture 10"/>
+            <wp:cNvGraphicFramePr>
+              <a:graphicFrameLocks xmlns:a="http://schemas.openxmlformats.org/drawingml/2006/main" noChangeAspect="1"/>
+            </wp:cNvGraphicFramePr>
+            <a:graphic xmlns:a="http://schemas.openxmlformats.org/drawingml/2006/main">
+              <a:graphicData uri="http://schemas.openxmlformats.org/drawingml/2006/picture">
+                <pic:pic xmlns:pic="http://schemas.openxmlformats.org/drawingml/2006/picture">
+                  <pic:nvPicPr>
+                    <pic:cNvPr id="0" name="Picture 26"/>
+                    <pic:cNvPicPr>
+                      <a:picLocks noChangeAspect="1" noChangeArrowheads="1"/>
+                    </pic:cNvPicPr>
+                  </pic:nvPicPr>
+                  <pic:blipFill>
+                    <a:blip r:embed="rId9" cstate="print">
+                      <a:extLst>
+                        <a:ext uri="{28A0092B-C50C-407E-A947-70E740481C1C}">
+                          <a14:useLocalDpi xmlns:a14="http://schemas.microsoft.com/office/drawing/2010/main" val="0"/>
+                        </a:ext>
+                      </a:extLst>
+                    </a:blip>
+                    <a:srcRect/>
+                    <a:stretch>
+                      <a:fillRect/>
+                    </a:stretch>
+                  </pic:blipFill>
+                  <pic:spPr bwMode="auto">
+                    <a:xfrm>
+                      <a:off x="0" y="0"/>
+                      <a:ext cx="5844364" cy="2605017"/>
+                    </a:xfrm>
+                    <a:prstGeom prst="rect">
+                      <a:avLst/>
+                    </a:prstGeom>
+                    <a:noFill/>
+                    <a:ln>
+                      <a:noFill/>
+                    </a:ln>
+                  </pic:spPr>
+                </pic:pic>
+              </a:graphicData>
+            </a:graphic>
+          </wp:inline>
+        </w:drawing>
+      </w:r>
+    </w:p>
+    <w:p>
+      <w:pPr>
+        <w:pStyle w:val="NormalWeb"/>
+      </w:pPr>
+      <w:hyperlink r:id="rId10" w:history="1">
+        <w:r>
+          <w:rPr>
+            <w:rStyle w:val="Hyperlink"/>
+          </w:rPr>
+          <w:t xml:space="preserve">Adding module 1.2 assignment ,03/27/2026 · </w:t>
+        </w:r>
+        <w:proofErr w:type="spellStart"/>
+        <w:r>
+          <w:rPr>
+            <w:rStyle w:val="Hyperlink"/>
+          </w:rPr>
+          <w:t>GirmaDingeto</w:t>
+        </w:r>
+        <w:proofErr w:type="spellEnd"/>
+        <w:r>
+          <w:rPr>
+            <w:rStyle w:val="Hyperlink"/>
+          </w:rPr>
+          <w:t>/csd-402@</w:t>
+        </w:r>
+        <w:r>
+          <w:rPr>
+            <w:rStyle w:val="Hyperlink"/>
+          </w:rPr>
+          <w:t>1</w:t>
+        </w:r>
+        <w:r>
+          <w:rPr>
+            <w:rStyle w:val="Hyperlink"/>
+          </w:rPr>
+          <w:t>d61f1d</w:t>
+        </w:r>
+      </w:hyperlink>
+    </w:p>
+    <w:p>
+      <w:pPr>
+        <w:pStyle w:val="NormalWeb"/>
+      </w:pPr>
     </w:p>
     <w:p>
       <w:pPr>
@@ -1200,6 +1332,41 @@
       <w14:ligatures w14:val="none"/>
     </w:rPr>
   </w:style>
+  <w:style w:type="character" w:styleId="Hyperlink">
+    <w:name w:val="Hyperlink"/>
+    <w:basedOn w:val="DefaultParagraphFont"/>
+    <w:uiPriority w:val="99"/>
+    <w:unhideWhenUsed/>
+    <w:rsid w:val="000E3340"/>
+    <w:rPr>
+      <w:color w:val="467886" w:themeColor="hyperlink"/>
+      <w:u w:val="single"/>
+    </w:rPr>
+  </w:style>
+  <w:style w:type="character" w:styleId="UnresolvedMention">
+    <w:name w:val="Unresolved Mention"/>
+    <w:basedOn w:val="DefaultParagraphFont"/>
+    <w:uiPriority w:val="99"/>
+    <w:semiHidden/>
+    <w:unhideWhenUsed/>
+    <w:rsid w:val="000E3340"/>
+    <w:rPr>
+      <w:color w:val="605E5C"/>
+      <w:shd w:val="clear" w:color="auto" w:fill="E1DFDD"/>
+    </w:rPr>
+  </w:style>
+  <w:style w:type="character" w:styleId="FollowedHyperlink">
+    <w:name w:val="FollowedHyperlink"/>
+    <w:basedOn w:val="DefaultParagraphFont"/>
+    <w:uiPriority w:val="99"/>
+    <w:semiHidden/>
+    <w:unhideWhenUsed/>
+    <w:rsid w:val="000E3340"/>
+    <w:rPr>
+      <w:color w:val="96607D" w:themeColor="followedHyperlink"/>
+      <w:u w:val="single"/>
+    </w:rPr>
+  </w:style>
 </w:styles>
 </file>
 

</xml_diff>